<commit_message>
Snapshot output/logs after today's runs; sync pitch_config and Product Cohort reference material
output/*.json + logs/*: latest Data Normalization Agent run (all 6 sources
clean) plus real cron log activity from today, including confirmation the
launchd/cron log pollution is resolved.

pitch_config/: picks up the external content sync's latest re-export --
verified before staging, not blind: Strategic Preface Mapping is an exact
rename (no content change), and the Hindi Pitch Scripts update adds a real
"Dehaat Center Ko Jaano" preface block to each sample script (matching the
DC Card feature), nothing removed. Also adds Club Scheme Reference, DC Card
(Preface), and Focus Product Targeting reference CSVs.

Product _cohort/: Postman collection/environment + auth doc for the Product
Cohort API client -- checked for embedded credentials before adding, none
present (secret-typed environment values are unset placeholders).

Co-Authored-By: Claude Sonnet 5 <noreply@anthropic.com>
</commit_message>
<xml_diff>
--- a/SE_DC_Data_Normalization_Agent_Prompt.docx
+++ b/SE_DC_Data_Normalization_Agent_Prompt.docx
@@ -3920,7 +3920,33 @@
         <w:t xml:space="preserve">Confirmed columns, mapped to what was requested:</w:t>
       </w:r>
       <w:r>
-        <w:t xml:space="preserve"> Category name → products_category.name (via products_template.category_id) — sub-category also available (products_subcategory.name), not requested but free with the same join. Product name → sale_orderrequestline.product_name (denormalized directly on the line item — no join needed). Business segment name → products_template.business_segment_name (confirmed live value: PRIVATE LABEL, likely others exist for non-PL segments). Brand name → sale_orderrequestline.product_brand (also denormalized directly — confirmed live values include NUTRI ONE, GAPL). Selling price per last invoice → sale_orderrequestline.price_unit, taking MAX(sale_orderrequest.created_at) per product per DC to identify "last." Discount per last invoice → sale_orderrequestline.discount_price_unit, same "last invoice" logic.</w:t>
+        <w:t xml:space="preserve"> Category name → products_category.name (via products_template.category_id) — sub-category also available (products_subcategory.name), not requested but free with the same join. Product name → sale_orderrequestline.product_name (denormalized directly on the line item — no join needed). Business segment name → products_template.business_segment_name (confirmed live value: PRIVATE LABEL, likely others exist for non-PL segments). Brand name → sale_orderrequestline.product_brand (also denormalized directly — confirmed live values include NUTRI ONE, GAPL).</w:t>
+      </w:r>
+    </w:p>
+    <w:p>
+      <w:pPr>
+        <w:pStyle w:val="ListParagraph"/>
+        <w:numPr>
+          <w:ilvl w:val="0"/>
+          <w:numId w:val="2"/>
+        </w:numPr>
+        <w:spacing w:after="80"/>
+      </w:pPr>
+      <w:r>
+        <w:t xml:space="preserve">Selling price per last invoice → sale_orderrequestline.price_unit, taking the row with MAX(sale_orderrequest.created_at) per product per DC. Confirmed trap this round — a naive GROUP BY breaks this: a query that groups by price_unit/discount_price_unit alongside product and DC (rather than selecting only the single latest row) fragments "last invoice" into one row per distinct price ever charged — confirmed live: one product/DC pair had 9 different price-discount combinations in a single 90-day window. Use DISTINCT ON (product_id, dc_id) ... ORDER BY product_id, dc_id, created_at DESC (or an equivalent window function) to correctly select exactly one row — the true latest — per product/DC pair.</w:t>
+      </w:r>
+    </w:p>
+    <w:p>
+      <w:pPr>
+        <w:pStyle w:val="ListParagraph"/>
+        <w:numPr>
+          <w:ilvl w:val="0"/>
+          <w:numId w:val="2"/>
+        </w:numPr>
+        <w:spacing w:after="80"/>
+      </w:pPr>
+      <w:r>
+        <w:t xml:space="preserve">Discount per last invoice → sale_orderrequestline.discount_price_unit, same "last invoice" logic and same DISTINCT ON requirement.</w:t>
       </w:r>
     </w:p>
     <w:p>
@@ -3970,6 +3996,311 @@
           <w:szCs w:val="20"/>
         </w:rPr>
         <w:t xml:space="preserve">Product_ID, Product_Name, Product_Brand, Category_Name, Sub_Category_Name, Business_Segment_Name, DC_ID, Last_Invoice_Date, Selling_Price (price_unit), Discount (discount_price_unit)</w:t>
+      </w:r>
+    </w:p>
+    <w:p>
+      <w:pPr>
+        <w:spacing w:after="160"/>
+      </w:pPr>
+      <w:r>
+        <w:rPr>
+          <w:b/>
+          <w:bCs/>
+        </w:rPr>
+        <w:t xml:space="preserve">Confirmed, corrected query — Product Master with true last-invoice pricing:</w:t>
+      </w:r>
+    </w:p>
+    <w:p>
+      <w:pPr>
+        <w:pBdr>
+          <w:top w:val="single" w:color="AAAAAA" w:sz="4" w:space="6"/>
+          <w:bottom w:val="single" w:color="AAAAAA" w:sz="4" w:space="6"/>
+          <w:left w:val="single" w:color="AAAAAA" w:sz="4" w:space="6"/>
+          <w:right w:val="single" w:color="AAAAAA" w:sz="4" w:space="6"/>
+        </w:pBdr>
+        <w:shd w:fill="F2F2F2" w:val="clear"/>
+        <w:spacing w:after="200" w:before="120"/>
+      </w:pPr>
+      <w:r>
+        <w:rPr>
+          <w:rFonts w:ascii="Consolas" w:cs="Consolas" w:eastAsia="Consolas" w:hAnsi="Consolas"/>
+          <w:color w:val="1F3864"/>
+          <w:sz w:val="18"/>
+          <w:szCs w:val="18"/>
+        </w:rPr>
+        <w:t xml:space="preserve">SELECT DISTINCT ON (p.id, sor.partner_id)</w:t>
+      </w:r>
+      <w:r>
+        <w:br/>
+      </w:r>
+      <w:r>
+        <w:rPr>
+          <w:rFonts w:ascii="Consolas" w:cs="Consolas" w:eastAsia="Consolas" w:hAnsi="Consolas"/>
+          <w:color w:val="1F3864"/>
+          <w:sz w:val="18"/>
+          <w:szCs w:val="18"/>
+        </w:rPr>
+        <w:t xml:space="preserve">    p.id                          AS product_id,</w:t>
+      </w:r>
+      <w:r>
+        <w:br/>
+      </w:r>
+      <w:r>
+        <w:rPr>
+          <w:rFonts w:ascii="Consolas" w:cs="Consolas" w:eastAsia="Consolas" w:hAnsi="Consolas"/>
+          <w:color w:val="1F3864"/>
+          <w:sz w:val="18"/>
+          <w:szCs w:val="18"/>
+        </w:rPr>
+        <w:t xml:space="preserve">    sol.product_name,</w:t>
+      </w:r>
+      <w:r>
+        <w:br/>
+      </w:r>
+      <w:r>
+        <w:rPr>
+          <w:rFonts w:ascii="Consolas" w:cs="Consolas" w:eastAsia="Consolas" w:hAnsi="Consolas"/>
+          <w:color w:val="1F3864"/>
+          <w:sz w:val="18"/>
+          <w:szCs w:val="18"/>
+        </w:rPr>
+        <w:t xml:space="preserve">    sol.product_brand,</w:t>
+      </w:r>
+      <w:r>
+        <w:br/>
+      </w:r>
+      <w:r>
+        <w:rPr>
+          <w:rFonts w:ascii="Consolas" w:cs="Consolas" w:eastAsia="Consolas" w:hAnsi="Consolas"/>
+          <w:color w:val="1F3864"/>
+          <w:sz w:val="18"/>
+          <w:szCs w:val="18"/>
+        </w:rPr>
+        <w:t xml:space="preserve">    pc.name                       AS category_name,</w:t>
+      </w:r>
+      <w:r>
+        <w:br/>
+      </w:r>
+      <w:r>
+        <w:rPr>
+          <w:rFonts w:ascii="Consolas" w:cs="Consolas" w:eastAsia="Consolas" w:hAnsi="Consolas"/>
+          <w:color w:val="1F3864"/>
+          <w:sz w:val="18"/>
+          <w:szCs w:val="18"/>
+        </w:rPr>
+        <w:t xml:space="preserve">    psc.name                      AS sub_category_name,</w:t>
+      </w:r>
+      <w:r>
+        <w:br/>
+      </w:r>
+      <w:r>
+        <w:rPr>
+          <w:rFonts w:ascii="Consolas" w:cs="Consolas" w:eastAsia="Consolas" w:hAnsi="Consolas"/>
+          <w:color w:val="1F3864"/>
+          <w:sz w:val="18"/>
+          <w:szCs w:val="18"/>
+        </w:rPr>
+        <w:t xml:space="preserve">    pt.business_segment_name,      -- 'PRIVATE LABEL' / 'BRANDED' — confirmed BO1 PL filter field</w:t>
+      </w:r>
+      <w:r>
+        <w:br/>
+      </w:r>
+      <w:r>
+        <w:rPr>
+          <w:rFonts w:ascii="Consolas" w:cs="Consolas" w:eastAsia="Consolas" w:hAnsi="Consolas"/>
+          <w:color w:val="1F3864"/>
+          <w:sz w:val="18"/>
+          <w:szCs w:val="18"/>
+        </w:rPr>
+        <w:t xml:space="preserve">    sor.partner_id                AS dc_id,</w:t>
+      </w:r>
+      <w:r>
+        <w:br/>
+      </w:r>
+      <w:r>
+        <w:rPr>
+          <w:rFonts w:ascii="Consolas" w:cs="Consolas" w:eastAsia="Consolas" w:hAnsi="Consolas"/>
+          <w:color w:val="1F3864"/>
+          <w:sz w:val="18"/>
+          <w:szCs w:val="18"/>
+        </w:rPr>
+        <w:t xml:space="preserve">    sor.created_at                AS last_invoice_date,</w:t>
+      </w:r>
+      <w:r>
+        <w:br/>
+      </w:r>
+      <w:r>
+        <w:rPr>
+          <w:rFonts w:ascii="Consolas" w:cs="Consolas" w:eastAsia="Consolas" w:hAnsi="Consolas"/>
+          <w:color w:val="1F3864"/>
+          <w:sz w:val="18"/>
+          <w:szCs w:val="18"/>
+        </w:rPr>
+        <w:t xml:space="preserve">    sol.price_unit                AS selling_price,</w:t>
+      </w:r>
+      <w:r>
+        <w:br/>
+      </w:r>
+      <w:r>
+        <w:rPr>
+          <w:rFonts w:ascii="Consolas" w:cs="Consolas" w:eastAsia="Consolas" w:hAnsi="Consolas"/>
+          <w:color w:val="1F3864"/>
+          <w:sz w:val="18"/>
+          <w:szCs w:val="18"/>
+        </w:rPr>
+        <w:t xml:space="preserve">    sol.discount_price_unit       AS discount</w:t>
+      </w:r>
+      <w:r>
+        <w:br/>
+      </w:r>
+      <w:r>
+        <w:rPr>
+          <w:rFonts w:ascii="Consolas" w:cs="Consolas" w:eastAsia="Consolas" w:hAnsi="Consolas"/>
+          <w:color w:val="1F3864"/>
+          <w:sz w:val="18"/>
+          <w:szCs w:val="18"/>
+        </w:rPr>
+        <w:t xml:space="preserve">FROM sale_orderrequestline sol</w:t>
+      </w:r>
+      <w:r>
+        <w:br/>
+      </w:r>
+      <w:r>
+        <w:rPr>
+          <w:rFonts w:ascii="Consolas" w:cs="Consolas" w:eastAsia="Consolas" w:hAnsi="Consolas"/>
+          <w:color w:val="1F3864"/>
+          <w:sz w:val="18"/>
+          <w:szCs w:val="18"/>
+        </w:rPr>
+        <w:t xml:space="preserve">JOIN products_product p</w:t>
+      </w:r>
+      <w:r>
+        <w:br/>
+      </w:r>
+      <w:r>
+        <w:rPr>
+          <w:rFonts w:ascii="Consolas" w:cs="Consolas" w:eastAsia="Consolas" w:hAnsi="Consolas"/>
+          <w:color w:val="1F3864"/>
+          <w:sz w:val="18"/>
+          <w:szCs w:val="18"/>
+        </w:rPr>
+        <w:t xml:space="preserve">    ON sol.product_id = p.id</w:t>
+      </w:r>
+      <w:r>
+        <w:br/>
+      </w:r>
+      <w:r>
+        <w:rPr>
+          <w:rFonts w:ascii="Consolas" w:cs="Consolas" w:eastAsia="Consolas" w:hAnsi="Consolas"/>
+          <w:color w:val="1F3864"/>
+          <w:sz w:val="18"/>
+          <w:szCs w:val="18"/>
+        </w:rPr>
+        <w:t xml:space="preserve">JOIN products_template pt</w:t>
+      </w:r>
+      <w:r>
+        <w:br/>
+      </w:r>
+      <w:r>
+        <w:rPr>
+          <w:rFonts w:ascii="Consolas" w:cs="Consolas" w:eastAsia="Consolas" w:hAnsi="Consolas"/>
+          <w:color w:val="1F3864"/>
+          <w:sz w:val="18"/>
+          <w:szCs w:val="18"/>
+        </w:rPr>
+        <w:t xml:space="preserve">    ON p.template_id = pt.id</w:t>
+      </w:r>
+      <w:r>
+        <w:br/>
+      </w:r>
+      <w:r>
+        <w:rPr>
+          <w:rFonts w:ascii="Consolas" w:cs="Consolas" w:eastAsia="Consolas" w:hAnsi="Consolas"/>
+          <w:color w:val="1F3864"/>
+          <w:sz w:val="18"/>
+          <w:szCs w:val="18"/>
+        </w:rPr>
+        <w:t xml:space="preserve">LEFT JOIN products_category pc</w:t>
+      </w:r>
+      <w:r>
+        <w:br/>
+      </w:r>
+      <w:r>
+        <w:rPr>
+          <w:rFonts w:ascii="Consolas" w:cs="Consolas" w:eastAsia="Consolas" w:hAnsi="Consolas"/>
+          <w:color w:val="1F3864"/>
+          <w:sz w:val="18"/>
+          <w:szCs w:val="18"/>
+        </w:rPr>
+        <w:t xml:space="preserve">    ON pt.category_id = pc.id</w:t>
+      </w:r>
+      <w:r>
+        <w:br/>
+      </w:r>
+      <w:r>
+        <w:rPr>
+          <w:rFonts w:ascii="Consolas" w:cs="Consolas" w:eastAsia="Consolas" w:hAnsi="Consolas"/>
+          <w:color w:val="1F3864"/>
+          <w:sz w:val="18"/>
+          <w:szCs w:val="18"/>
+        </w:rPr>
+        <w:t xml:space="preserve">LEFT JOIN products_subcategory psc</w:t>
+      </w:r>
+      <w:r>
+        <w:br/>
+      </w:r>
+      <w:r>
+        <w:rPr>
+          <w:rFonts w:ascii="Consolas" w:cs="Consolas" w:eastAsia="Consolas" w:hAnsi="Consolas"/>
+          <w:color w:val="1F3864"/>
+          <w:sz w:val="18"/>
+          <w:szCs w:val="18"/>
+        </w:rPr>
+        <w:t xml:space="preserve">    ON pt.sub_category_id = psc.id</w:t>
+      </w:r>
+      <w:r>
+        <w:br/>
+      </w:r>
+      <w:r>
+        <w:rPr>
+          <w:rFonts w:ascii="Consolas" w:cs="Consolas" w:eastAsia="Consolas" w:hAnsi="Consolas"/>
+          <w:color w:val="1F3864"/>
+          <w:sz w:val="18"/>
+          <w:szCs w:val="18"/>
+        </w:rPr>
+        <w:t xml:space="preserve">JOIN sale_orderrequest sor</w:t>
+      </w:r>
+      <w:r>
+        <w:br/>
+      </w:r>
+      <w:r>
+        <w:rPr>
+          <w:rFonts w:ascii="Consolas" w:cs="Consolas" w:eastAsia="Consolas" w:hAnsi="Consolas"/>
+          <w:color w:val="1F3864"/>
+          <w:sz w:val="18"/>
+          <w:szCs w:val="18"/>
+        </w:rPr>
+        <w:t xml:space="preserve">    ON sol.order_request_id = sor.id</w:t>
+      </w:r>
+      <w:r>
+        <w:br/>
+      </w:r>
+      <w:r>
+        <w:rPr>
+          <w:rFonts w:ascii="Consolas" w:cs="Consolas" w:eastAsia="Consolas" w:hAnsi="Consolas"/>
+          <w:color w:val="1F3864"/>
+          <w:sz w:val="18"/>
+          <w:szCs w:val="18"/>
+        </w:rPr>
+        <w:t xml:space="preserve">ORDER BY p.id, sor.partner_id, sor.created_at DESC;</w:t>
+      </w:r>
+    </w:p>
+    <w:p>
+      <w:pPr>
+        <w:spacing w:after="160"/>
+      </w:pPr>
+      <w:r>
+        <w:t xml:space="preserve">Live-tested against database_id 31 — confirmed correct at both the single-pair level (product 11000063 × DC 89663: 9 rows with the naive GROUP BY approach, exactly 1 row with DISTINCT ON, correctly showing the actual latest invoice — ₹590, discount ₹565, 13-Aug-2026) and at scale (sample of 10 product/DC pairs, one row each, no duplicates). This replaces the originally proposed version, which used GROUP BY p.id, ..., sol.price_unit, sol.discount_price_unit — including the price/discount columns in the GROUP BY is exactly what caused the fragmentation. Add a WHERE sor.created_at &gt;= &lt;date&gt; filter for a bounded window in production; without one, this scans full history.</w:t>
       </w:r>
     </w:p>
     <w:p>
@@ -6803,6 +7134,46 @@
         <w:spacing w:after="80"/>
       </w:pPr>
       <w:r>
+        <w:rPr>
+          <w:b/>
+          <w:bCs/>
+        </w:rPr>
+        <w:t xml:space="preserve">"Last invoice" queries must use DISTINCT ON or a window function, never GROUP BY on a value that can change between invoices — confirmed trap this round (Source 3h):</w:t>
+      </w:r>
+      <w:r>
+        <w:t xml:space="preserve"> grouping by price_unit/discount_price_unit alongside product and DC silently fragments "the last invoice" into one row per distinct price ever charged. Confirmed live: one product/DC pair had 9 different price points in a single 90-day window. This pattern generalizes beyond Source 3h — any "most recent X" query needs to select the single latest row directly, not group by the very value that's supposed to vary over time.</w:t>
+      </w:r>
+    </w:p>
+    <w:p>
+      <w:pPr>
+        <w:pStyle w:val="ListParagraph"/>
+        <w:numPr>
+          <w:ilvl w:val="0"/>
+          <w:numId w:val="2"/>
+        </w:numPr>
+        <w:spacing w:after="80"/>
+      </w:pPr>
+      <w:r>
+        <w:rPr>
+          <w:b/>
+          <w:bCs/>
+        </w:rPr>
+        <w:t xml:space="preserve">"Top-1 per group" queries need ROW_NUMBER(), not RANK(), unless duplicates on ties are actually wanted — confirmed trap this round (Business Area Strength):</w:t>
+      </w:r>
+      <w:r>
+        <w:t xml:space="preserve"> RANK() gives every tied row the same rank, so a query filtering on rank = 1 returns 2+ rows for any group with a tie. Confirmed live: 3 of 10,206 DCs had a tied top category, producing duplicate rows. ROW_NUMBER() with an explicit deterministic tie-break (e.g. alphabetical on a secondary column) guarantees exactly one row per group.</w:t>
+      </w:r>
+    </w:p>
+    <w:p>
+      <w:pPr>
+        <w:pStyle w:val="ListParagraph"/>
+        <w:numPr>
+          <w:ilvl w:val="0"/>
+          <w:numId w:val="2"/>
+        </w:numPr>
+        <w:spacing w:after="80"/>
+      </w:pPr>
+      <w:r>
         <w:t xml:space="preserve">DC Master numeric fields: strip thousands-separator commas before casting to numeric (e.g. </w:t>
       </w:r>
       <w:r>
@@ -10797,6 +11168,1110 @@
       </w:r>
       <w:r>
         <w:t xml:space="preserve"> — applying the known trap already documented for sale_orderrequest (exclude non-processed/cancelled orders). Worth retrofitting the #3 query with the same filter for consistency.</w:t>
+      </w:r>
+    </w:p>
+    <w:p>
+      <w:pPr>
+        <w:pStyle w:val="Heading3"/>
+        <w:spacing w:after="100" w:before="200"/>
+      </w:pPr>
+      <w:r>
+        <w:t xml:space="preserve">Dehaat Center Ko Jaano — DC Briefing Framework for the Pitching Agent</w:t>
+      </w:r>
+    </w:p>
+    <w:p>
+      <w:pPr>
+        <w:spacing w:after="160"/>
+      </w:pPr>
+      <w:r>
+        <w:t xml:space="preserve">A second, complementary framework for the Pitching Agent — a 3-part DC profile ("Who," "Where DC Stand," "Private Label") to brief the SE before a visit. Worth noting up front: most of this reuses sources already confirmed above, not new investigation — only the crop-specific sub-points are genuine gaps.</w:t>
+      </w:r>
+    </w:p>
+    <w:tbl>
+      <w:tblPr>
+        <w:tblW w:type="dxa" w:w="9500"/>
+        <w:tblBorders>
+          <w:top w:val="single" w:color="auto" w:sz="4"/>
+          <w:left w:val="single" w:color="auto" w:sz="4"/>
+          <w:bottom w:val="single" w:color="auto" w:sz="4"/>
+          <w:right w:val="single" w:color="auto" w:sz="4"/>
+          <w:insideH w:val="single" w:color="auto" w:sz="4"/>
+          <w:insideV w:val="single" w:color="auto" w:sz="4"/>
+        </w:tblBorders>
+      </w:tblPr>
+      <w:tblGrid>
+        <w:gridCol w:w="1500"/>
+        <w:gridCol w:w="2800"/>
+        <w:gridCol w:w="3600"/>
+        <w:gridCol w:w="1600"/>
+      </w:tblGrid>
+      <w:tr>
+        <w:trPr>
+          <w:tblHeader/>
+        </w:trPr>
+        <w:tc>
+          <w:tcPr>
+            <w:tcW w:type="dxa" w:w="1500"/>
+            <w:shd w:fill="2F5496" w:val="clear"/>
+            <w:tcMar>
+              <w:top w:type="dxa" w:w="100"/>
+              <w:left w:type="dxa" w:w="120"/>
+              <w:bottom w:type="dxa" w:w="100"/>
+              <w:right w:type="dxa" w:w="120"/>
+            </w:tcMar>
+          </w:tcPr>
+          <w:p>
+            <w:r>
+              <w:rPr>
+                <w:b/>
+                <w:bCs/>
+                <w:color w:val="FFFFFF"/>
+              </w:rPr>
+              <w:t xml:space="preserve">Category</w:t>
+            </w:r>
+          </w:p>
+        </w:tc>
+        <w:tc>
+          <w:tcPr>
+            <w:tcW w:type="dxa" w:w="2800"/>
+            <w:shd w:fill="2F5496" w:val="clear"/>
+            <w:tcMar>
+              <w:top w:type="dxa" w:w="100"/>
+              <w:left w:type="dxa" w:w="120"/>
+              <w:bottom w:type="dxa" w:w="100"/>
+              <w:right w:type="dxa" w:w="120"/>
+            </w:tcMar>
+          </w:tcPr>
+          <w:p>
+            <w:r>
+              <w:rPr>
+                <w:b/>
+                <w:bCs/>
+                <w:color w:val="FFFFFF"/>
+              </w:rPr>
+              <w:t xml:space="preserve">Sub-point</w:t>
+            </w:r>
+          </w:p>
+        </w:tc>
+        <w:tc>
+          <w:tcPr>
+            <w:tcW w:type="dxa" w:w="3600"/>
+            <w:shd w:fill="2F5496" w:val="clear"/>
+            <w:tcMar>
+              <w:top w:type="dxa" w:w="100"/>
+              <w:left w:type="dxa" w:w="120"/>
+              <w:bottom w:type="dxa" w:w="100"/>
+              <w:right w:type="dxa" w:w="120"/>
+            </w:tcMar>
+          </w:tcPr>
+          <w:p>
+            <w:r>
+              <w:rPr>
+                <w:b/>
+                <w:bCs/>
+                <w:color w:val="FFFFFF"/>
+              </w:rPr>
+              <w:t xml:space="preserve">Status</w:t>
+            </w:r>
+          </w:p>
+        </w:tc>
+        <w:tc>
+          <w:tcPr>
+            <w:tcW w:type="dxa" w:w="1600"/>
+            <w:shd w:fill="2F5496" w:val="clear"/>
+            <w:tcMar>
+              <w:top w:type="dxa" w:w="100"/>
+              <w:left w:type="dxa" w:w="120"/>
+              <w:bottom w:type="dxa" w:w="100"/>
+              <w:right w:type="dxa" w:w="120"/>
+            </w:tcMar>
+          </w:tcPr>
+          <w:p>
+            <w:r>
+              <w:rPr>
+                <w:b/>
+                <w:bCs/>
+                <w:color w:val="FFFFFF"/>
+              </w:rPr>
+              <w:t xml:space="preserve">Source</w:t>
+            </w:r>
+          </w:p>
+        </w:tc>
+      </w:tr>
+      <w:tr>
+        <w:trPr>
+          <w:tblHeader w:val="false"/>
+        </w:trPr>
+        <w:tc>
+          <w:tcPr>
+            <w:tcW w:type="dxa" w:w="1500"/>
+            <w:tcMar>
+              <w:top w:type="dxa" w:w="100"/>
+              <w:left w:type="dxa" w:w="120"/>
+              <w:bottom w:type="dxa" w:w="100"/>
+              <w:right w:type="dxa" w:w="120"/>
+            </w:tcMar>
+          </w:tcPr>
+          <w:p>
+            <w:r>
+              <w:t xml:space="preserve">1) Who</w:t>
+            </w:r>
+          </w:p>
+        </w:tc>
+        <w:tc>
+          <w:tcPr>
+            <w:tcW w:type="dxa" w:w="2800"/>
+            <w:tcMar>
+              <w:top w:type="dxa" w:w="100"/>
+              <w:left w:type="dxa" w:w="120"/>
+              <w:bottom w:type="dxa" w:w="100"/>
+              <w:right w:type="dxa" w:w="120"/>
+            </w:tcMar>
+          </w:tcPr>
+          <w:p>
+            <w:r>
+              <w:t xml:space="preserve">Business area strength (Herbicide/Pesticide/Seed, etc.)</w:t>
+            </w:r>
+          </w:p>
+        </w:tc>
+        <w:tc>
+          <w:tcPr>
+            <w:tcW w:type="dxa" w:w="3600"/>
+            <w:tcMar>
+              <w:top w:type="dxa" w:w="100"/>
+              <w:left w:type="dxa" w:w="120"/>
+              <w:bottom w:type="dxa" w:w="100"/>
+              <w:right w:type="dxa" w:w="120"/>
+            </w:tcMar>
+          </w:tcPr>
+          <w:p>
+            <w:r>
+              <w:t xml:space="preserve">✅ Ready for Pitching Agent — query confirmed live this round. Ranks each DC's product sub-categories by net purchase value (12-month window), surfaces the top one. See confirmed query below.</w:t>
+            </w:r>
+          </w:p>
+        </w:tc>
+        <w:tc>
+          <w:tcPr>
+            <w:tcW w:type="dxa" w:w="1600"/>
+            <w:tcMar>
+              <w:top w:type="dxa" w:w="100"/>
+              <w:left w:type="dxa" w:w="120"/>
+              <w:bottom w:type="dxa" w:w="100"/>
+              <w:right w:type="dxa" w:w="120"/>
+            </w:tcMar>
+          </w:tcPr>
+          <w:p>
+            <w:r>
+              <w:t xml:space="preserve">Source 3h</w:t>
+            </w:r>
+          </w:p>
+        </w:tc>
+      </w:tr>
+      <w:tr>
+        <w:trPr>
+          <w:tblHeader w:val="false"/>
+        </w:trPr>
+        <w:tc>
+          <w:tcPr>
+            <w:tcW w:type="dxa" w:w="1500"/>
+            <w:tcMar>
+              <w:top w:type="dxa" w:w="100"/>
+              <w:left w:type="dxa" w:w="120"/>
+              <w:bottom w:type="dxa" w:w="100"/>
+              <w:right w:type="dxa" w:w="120"/>
+            </w:tcMar>
+          </w:tcPr>
+          <w:p/>
+        </w:tc>
+        <w:tc>
+          <w:tcPr>
+            <w:tcW w:type="dxa" w:w="2800"/>
+            <w:tcMar>
+              <w:top w:type="dxa" w:w="100"/>
+              <w:left w:type="dxa" w:w="120"/>
+              <w:bottom w:type="dxa" w:w="100"/>
+              <w:right w:type="dxa" w:w="120"/>
+            </w:tcMar>
+          </w:tcPr>
+          <w:p>
+            <w:r>
+              <w:t xml:space="preserve">Turnover-wise standing</w:t>
+            </w:r>
+          </w:p>
+        </w:tc>
+        <w:tc>
+          <w:tcPr>
+            <w:tcW w:type="dxa" w:w="3600"/>
+            <w:tcMar>
+              <w:top w:type="dxa" w:w="100"/>
+              <w:left w:type="dxa" w:w="120"/>
+              <w:bottom w:type="dxa" w:w="100"/>
+              <w:right w:type="dxa" w:w="120"/>
+            </w:tcMar>
+          </w:tcPr>
+          <w:p>
+            <w:r>
+              <w:t xml:space="preserve">✅ Ready — already covered by Section 10 items #6/#7 (Last Year / YTD DC Purchase) or Source 3g's Qualifying_Turnover</w:t>
+            </w:r>
+          </w:p>
+        </w:tc>
+        <w:tc>
+          <w:tcPr>
+            <w:tcW w:type="dxa" w:w="1600"/>
+            <w:tcMar>
+              <w:top w:type="dxa" w:w="100"/>
+              <w:left w:type="dxa" w:w="120"/>
+              <w:bottom w:type="dxa" w:w="100"/>
+              <w:right w:type="dxa" w:w="120"/>
+            </w:tcMar>
+          </w:tcPr>
+          <w:p>
+            <w:r>
+              <w:t xml:space="preserve">Source 3d/3g</w:t>
+            </w:r>
+          </w:p>
+        </w:tc>
+      </w:tr>
+      <w:tr>
+        <w:trPr>
+          <w:tblHeader w:val="false"/>
+        </w:trPr>
+        <w:tc>
+          <w:tcPr>
+            <w:tcW w:type="dxa" w:w="1500"/>
+            <w:tcMar>
+              <w:top w:type="dxa" w:w="100"/>
+              <w:left w:type="dxa" w:w="120"/>
+              <w:bottom w:type="dxa" w:w="100"/>
+              <w:right w:type="dxa" w:w="120"/>
+            </w:tcMar>
+          </w:tcPr>
+          <w:p/>
+        </w:tc>
+        <w:tc>
+          <w:tcPr>
+            <w:tcW w:type="dxa" w:w="2800"/>
+            <w:tcMar>
+              <w:top w:type="dxa" w:w="100"/>
+              <w:left w:type="dxa" w:w="120"/>
+              <w:bottom w:type="dxa" w:w="100"/>
+              <w:right w:type="dxa" w:w="120"/>
+            </w:tcMar>
+          </w:tcPr>
+          <w:p>
+            <w:r>
+              <w:t xml:space="preserve">Repayment Cycle</w:t>
+            </w:r>
+          </w:p>
+        </w:tc>
+        <w:tc>
+          <w:tcPr>
+            <w:tcW w:type="dxa" w:w="3600"/>
+            <w:tcMar>
+              <w:top w:type="dxa" w:w="100"/>
+              <w:left w:type="dxa" w:w="120"/>
+              <w:bottom w:type="dxa" w:w="100"/>
+              <w:right w:type="dxa" w:w="120"/>
+            </w:tcMar>
+          </w:tcPr>
+          <w:p>
+            <w:r>
+              <w:t xml:space="preserve">✅ Ready — Avg Repayment days and Paid within due days are already-confirmed columns in Source 2 (DC_RAnk.csv); promise_date/promise_amount (Source 3d) adds live commitment tracking</w:t>
+            </w:r>
+          </w:p>
+        </w:tc>
+        <w:tc>
+          <w:tcPr>
+            <w:tcW w:type="dxa" w:w="1600"/>
+            <w:tcMar>
+              <w:top w:type="dxa" w:w="100"/>
+              <w:left w:type="dxa" w:w="120"/>
+              <w:bottom w:type="dxa" w:w="100"/>
+              <w:right w:type="dxa" w:w="120"/>
+            </w:tcMar>
+          </w:tcPr>
+          <w:p>
+            <w:r>
+              <w:t xml:space="preserve">Source 2, Source 3d</w:t>
+            </w:r>
+          </w:p>
+        </w:tc>
+      </w:tr>
+      <w:tr>
+        <w:trPr>
+          <w:tblHeader w:val="false"/>
+        </w:trPr>
+        <w:tc>
+          <w:tcPr>
+            <w:tcW w:type="dxa" w:w="1500"/>
+            <w:tcMar>
+              <w:top w:type="dxa" w:w="100"/>
+              <w:left w:type="dxa" w:w="120"/>
+              <w:bottom w:type="dxa" w:w="100"/>
+              <w:right w:type="dxa" w:w="120"/>
+            </w:tcMar>
+          </w:tcPr>
+          <w:p/>
+        </w:tc>
+        <w:tc>
+          <w:tcPr>
+            <w:tcW w:type="dxa" w:w="2800"/>
+            <w:tcMar>
+              <w:top w:type="dxa" w:w="100"/>
+              <w:left w:type="dxa" w:w="120"/>
+              <w:bottom w:type="dxa" w:w="100"/>
+              <w:right w:type="dxa" w:w="120"/>
+            </w:tcMar>
+          </w:tcPr>
+          <w:p>
+            <w:r>
+              <w:t xml:space="preserve">Scheme standing</w:t>
+            </w:r>
+          </w:p>
+        </w:tc>
+        <w:tc>
+          <w:tcPr>
+            <w:tcW w:type="dxa" w:w="3600"/>
+            <w:tcMar>
+              <w:top w:type="dxa" w:w="100"/>
+              <w:left w:type="dxa" w:w="120"/>
+              <w:bottom w:type="dxa" w:w="100"/>
+              <w:right w:type="dxa" w:w="120"/>
+            </w:tcMar>
+          </w:tcPr>
+          <w:p>
+            <w:r>
+              <w:t xml:space="preserve">✅ Ready — Source 3g's confirmed Club_Tier, Qualifying_Turnover, Outstanding_Cleared, TOD_Percent</w:t>
+            </w:r>
+          </w:p>
+        </w:tc>
+        <w:tc>
+          <w:tcPr>
+            <w:tcW w:type="dxa" w:w="1600"/>
+            <w:tcMar>
+              <w:top w:type="dxa" w:w="100"/>
+              <w:left w:type="dxa" w:w="120"/>
+              <w:bottom w:type="dxa" w:w="100"/>
+              <w:right w:type="dxa" w:w="120"/>
+            </w:tcMar>
+          </w:tcPr>
+          <w:p>
+            <w:r>
+              <w:t xml:space="preserve">Source 3g</w:t>
+            </w:r>
+          </w:p>
+        </w:tc>
+      </w:tr>
+      <w:tr>
+        <w:trPr>
+          <w:tblHeader w:val="false"/>
+        </w:trPr>
+        <w:tc>
+          <w:tcPr>
+            <w:tcW w:type="dxa" w:w="1500"/>
+            <w:tcMar>
+              <w:top w:type="dxa" w:w="100"/>
+              <w:left w:type="dxa" w:w="120"/>
+              <w:bottom w:type="dxa" w:w="100"/>
+              <w:right w:type="dxa" w:w="120"/>
+            </w:tcMar>
+          </w:tcPr>
+          <w:p>
+            <w:r>
+              <w:t xml:space="preserve">2) Where DC Stand</w:t>
+            </w:r>
+          </w:p>
+        </w:tc>
+        <w:tc>
+          <w:tcPr>
+            <w:tcW w:type="dxa" w:w="2800"/>
+            <w:tcMar>
+              <w:top w:type="dxa" w:w="100"/>
+              <w:left w:type="dxa" w:w="120"/>
+              <w:bottom w:type="dxa" w:w="100"/>
+              <w:right w:type="dxa" w:w="120"/>
+            </w:tcMar>
+          </w:tcPr>
+          <w:p>
+            <w:r>
+              <w:t xml:space="preserve">Crop type / crop style</w:t>
+            </w:r>
+          </w:p>
+        </w:tc>
+        <w:tc>
+          <w:tcPr>
+            <w:tcW w:type="dxa" w:w="3600"/>
+            <w:tcMar>
+              <w:top w:type="dxa" w:w="100"/>
+              <w:left w:type="dxa" w:w="120"/>
+              <w:bottom w:type="dxa" w:w="100"/>
+              <w:right w:type="dxa" w:w="120"/>
+            </w:tcMar>
+          </w:tcPr>
+          <w:p>
+            <w:r>
+              <w:t xml:space="preserve">❌ Still a genuine gap for this specific DC-first question — the "Product Cohort" API investigated runs the opposite direction (product → crop-seasonality → DC cohort), so it doesn't give a direct "what crop does this DC serve" lookup. It's not a dead end for the Pitching Agent generally, though — see the new item below, which uses the same tool for a real, separate capability.</w:t>
+            </w:r>
+          </w:p>
+        </w:tc>
+        <w:tc>
+          <w:tcPr>
+            <w:tcW w:type="dxa" w:w="1600"/>
+            <w:tcMar>
+              <w:top w:type="dxa" w:w="100"/>
+              <w:left w:type="dxa" w:w="120"/>
+              <w:bottom w:type="dxa" w:w="100"/>
+              <w:right w:type="dxa" w:w="120"/>
+            </w:tcMar>
+          </w:tcPr>
+          <w:p>
+            <w:r>
+              <w:t xml:space="preserve">None confirmed for direct DC→crop lookup</w:t>
+            </w:r>
+          </w:p>
+        </w:tc>
+      </w:tr>
+      <w:tr>
+        <w:trPr>
+          <w:tblHeader w:val="false"/>
+        </w:trPr>
+        <w:tc>
+          <w:tcPr>
+            <w:tcW w:type="dxa" w:w="1500"/>
+            <w:tcMar>
+              <w:top w:type="dxa" w:w="100"/>
+              <w:left w:type="dxa" w:w="120"/>
+              <w:bottom w:type="dxa" w:w="100"/>
+              <w:right w:type="dxa" w:w="120"/>
+            </w:tcMar>
+          </w:tcPr>
+          <w:p/>
+        </w:tc>
+        <w:tc>
+          <w:tcPr>
+            <w:tcW w:type="dxa" w:w="2800"/>
+            <w:tcMar>
+              <w:top w:type="dxa" w:w="100"/>
+              <w:left w:type="dxa" w:w="120"/>
+              <w:bottom w:type="dxa" w:w="100"/>
+              <w:right w:type="dxa" w:w="120"/>
+            </w:tcMar>
+          </w:tcPr>
+          <w:p>
+            <w:r>
+              <w:t xml:space="preserve">(New capability, distinct from the DC profile above) Focus Product campaign targeting — which DCs to push a specific product to, and when</w:t>
+            </w:r>
+          </w:p>
+        </w:tc>
+        <w:tc>
+          <w:tcPr>
+            <w:tcW w:type="dxa" w:w="3600"/>
+            <w:tcMar>
+              <w:top w:type="dxa" w:w="100"/>
+              <w:left w:type="dxa" w:w="120"/>
+              <w:bottom w:type="dxa" w:w="100"/>
+              <w:right w:type="dxa" w:w="120"/>
+            </w:tcMar>
+          </w:tcPr>
+          <w:p>
+            <w:r>
+              <w:t xml:space="preserve">🟡 Real capability confirmed to exist, output schema not yet confirmed. Given one Focus Product, the tool's confirmed flow produces: historical purchase pattern (Step 2A), an LLM-inferred crop-seasonality read — buildup/peak/closure weeks (Step 2B), and a target DC cohort for that product (Step 3). Not live-verified — no API access, response schemas for Steps 2B/3 are empty in the source Postman collection.</w:t>
+            </w:r>
+          </w:p>
+        </w:tc>
+        <w:tc>
+          <w:tcPr>
+            <w:tcW w:type="dxa" w:w="1600"/>
+            <w:tcMar>
+              <w:top w:type="dxa" w:w="100"/>
+              <w:left w:type="dxa" w:w="120"/>
+              <w:bottom w:type="dxa" w:w="100"/>
+              <w:right w:type="dxa" w:w="120"/>
+            </w:tcMar>
+          </w:tcPr>
+          <w:p>
+            <w:r>
+              <w:t xml:space="preserve">"Product Cohort" API (saas-platform-service.api.dehat.net/sps/v1/fp) — access-blocked</w:t>
+            </w:r>
+          </w:p>
+        </w:tc>
+      </w:tr>
+      <w:tr>
+        <w:trPr>
+          <w:tblHeader w:val="false"/>
+        </w:trPr>
+        <w:tc>
+          <w:tcPr>
+            <w:tcW w:type="dxa" w:w="1500"/>
+            <w:tcMar>
+              <w:top w:type="dxa" w:w="100"/>
+              <w:left w:type="dxa" w:w="120"/>
+              <w:bottom w:type="dxa" w:w="100"/>
+              <w:right w:type="dxa" w:w="120"/>
+            </w:tcMar>
+          </w:tcPr>
+          <w:p/>
+        </w:tc>
+        <w:tc>
+          <w:tcPr>
+            <w:tcW w:type="dxa" w:w="2800"/>
+            <w:tcMar>
+              <w:top w:type="dxa" w:w="100"/>
+              <w:left w:type="dxa" w:w="120"/>
+              <w:bottom w:type="dxa" w:w="100"/>
+              <w:right w:type="dxa" w:w="120"/>
+            </w:tcMar>
+          </w:tcPr>
+          <w:p>
+            <w:r>
+              <w:t xml:space="preserve">What's upcoming to sell</w:t>
+            </w:r>
+          </w:p>
+        </w:tc>
+        <w:tc>
+          <w:tcPr>
+            <w:tcW w:type="dxa" w:w="3600"/>
+            <w:tcMar>
+              <w:top w:type="dxa" w:w="100"/>
+              <w:left w:type="dxa" w:w="120"/>
+              <w:bottom w:type="dxa" w:w="100"/>
+              <w:right w:type="dxa" w:w="120"/>
+            </w:tcMar>
+          </w:tcPr>
+          <w:p>
+            <w:r>
+              <w:t xml:space="preserve">🟡 No true crop-calendar source exists, but a proxy is buildable today: this DC's same-period-last-year purchase pattern (item #6) combined with Same Block Purchase (item #1)</w:t>
+            </w:r>
+          </w:p>
+        </w:tc>
+        <w:tc>
+          <w:tcPr>
+            <w:tcW w:type="dxa" w:w="1600"/>
+            <w:tcMar>
+              <w:top w:type="dxa" w:w="100"/>
+              <w:left w:type="dxa" w:w="120"/>
+              <w:bottom w:type="dxa" w:w="100"/>
+              <w:right w:type="dxa" w:w="120"/>
+            </w:tcMar>
+          </w:tcPr>
+          <w:p>
+            <w:r>
+              <w:t xml:space="preserve">Source 3d (proxy only)</w:t>
+            </w:r>
+          </w:p>
+        </w:tc>
+      </w:tr>
+      <w:tr>
+        <w:trPr>
+          <w:tblHeader w:val="false"/>
+        </w:trPr>
+        <w:tc>
+          <w:tcPr>
+            <w:tcW w:type="dxa" w:w="1500"/>
+            <w:tcMar>
+              <w:top w:type="dxa" w:w="100"/>
+              <w:left w:type="dxa" w:w="120"/>
+              <w:bottom w:type="dxa" w:w="100"/>
+              <w:right w:type="dxa" w:w="120"/>
+            </w:tcMar>
+          </w:tcPr>
+          <w:p>
+            <w:r>
+              <w:t xml:space="preserve">3) Private Label</w:t>
+            </w:r>
+          </w:p>
+        </w:tc>
+        <w:tc>
+          <w:tcPr>
+            <w:tcW w:type="dxa" w:w="2800"/>
+            <w:tcMar>
+              <w:top w:type="dxa" w:w="100"/>
+              <w:left w:type="dxa" w:w="120"/>
+              <w:bottom w:type="dxa" w:w="100"/>
+              <w:right w:type="dxa" w:w="120"/>
+            </w:tcMar>
+          </w:tcPr>
+          <w:p>
+            <w:r>
+              <w:t xml:space="preserve">Brief on which PL products sell</w:t>
+            </w:r>
+          </w:p>
+        </w:tc>
+        <w:tc>
+          <w:tcPr>
+            <w:tcW w:type="dxa" w:w="3600"/>
+            <w:tcMar>
+              <w:top w:type="dxa" w:w="100"/>
+              <w:left w:type="dxa" w:w="120"/>
+              <w:bottom w:type="dxa" w:w="100"/>
+              <w:right w:type="dxa" w:w="120"/>
+            </w:tcMar>
+          </w:tcPr>
+          <w:p>
+            <w:r>
+              <w:t xml:space="preserve">✅ Ready — already covered by item #8 (YTD Private Label) plus Source 3h's product_name/product_brand filtered on business_segment_name = 'PRIVATE LABEL'</w:t>
+            </w:r>
+          </w:p>
+        </w:tc>
+        <w:tc>
+          <w:tcPr>
+            <w:tcW w:type="dxa" w:w="1600"/>
+            <w:tcMar>
+              <w:top w:type="dxa" w:w="100"/>
+              <w:left w:type="dxa" w:w="120"/>
+              <w:bottom w:type="dxa" w:w="100"/>
+              <w:right w:type="dxa" w:w="120"/>
+            </w:tcMar>
+          </w:tcPr>
+          <w:p>
+            <w:r>
+              <w:t xml:space="preserve">Source 3d/3h</w:t>
+            </w:r>
+          </w:p>
+        </w:tc>
+      </w:tr>
+    </w:tbl>
+    <w:p>
+      <w:pPr>
+        <w:spacing w:before="160"/>
+      </w:pPr>
+    </w:p>
+    <w:p>
+      <w:pPr>
+        <w:spacing w:after="160"/>
+      </w:pPr>
+      <w:r>
+        <w:rPr>
+          <w:b/>
+          <w:bCs/>
+        </w:rPr>
+        <w:t xml:space="preserve">Net: 5 of 7 sub-points are now fully ready.</w:t>
+      </w:r>
+      <w:r>
+        <w:t xml:space="preserve"> Crop type/style remains a genuine gap for the DC-first "know your DC" profile — no source answers that direction. "Upcoming to sell" has a workable proxy, not a real answer. The newly-added Focus Product campaign targeting item is a distinct, real capability (confirmed to exist via the Product Cohort API) but currently access-blocked, same as the crop-classification gap it sits next to — the two look similar on the surface but are genuinely different problems: one has no data source at all, the other has a real source with just no access to verify its output.</w:t>
+      </w:r>
+    </w:p>
+    <w:p>
+      <w:pPr>
+        <w:spacing w:after="160"/>
+      </w:pPr>
+      <w:r>
+        <w:rPr>
+          <w:b/>
+          <w:bCs/>
+        </w:rPr>
+        <w:t xml:space="preserve">A "Product Cohort" internal tool was investigated as a candidate for the crop-classification gap</w:t>
+      </w:r>
+      <w:r>
+        <w:t xml:space="preserve"> (Postman collection Product Cohort — /sps/v1/fp, hosted at saas-platform-service.api.dehat.net). Two separate things are true about it, worth keeping distinct rather than one flat verdict:</w:t>
+      </w:r>
+    </w:p>
+    <w:p>
+      <w:pPr>
+        <w:pStyle w:val="ListParagraph"/>
+        <w:numPr>
+          <w:ilvl w:val="0"/>
+          <w:numId w:val="2"/>
+        </w:numPr>
+        <w:spacing w:after="80"/>
+      </w:pPr>
+      <w:r>
+        <w:rPr>
+          <w:b/>
+          <w:bCs/>
+        </w:rPr>
+        <w:t xml:space="preserve">It does not answer "given this DC, what crop does it serve"</w:t>
+      </w:r>
+      <w:r>
+        <w:t xml:space="preserve"> — the wizard is product-first (pick a material → get its seasonal curve → get target districts and a DC cohort for that material), the reverse of a DC-first lookup. This specific gap in the "Dehaat Center Ko Jaano" framework stays open.</w:t>
+      </w:r>
+    </w:p>
+    <w:p>
+      <w:pPr>
+        <w:pStyle w:val="ListParagraph"/>
+        <w:numPr>
+          <w:ilvl w:val="0"/>
+          <w:numId w:val="2"/>
+        </w:numPr>
+        <w:spacing w:after="80"/>
+      </w:pPr>
+      <w:r>
+        <w:rPr>
+          <w:b/>
+          <w:bCs/>
+        </w:rPr>
+        <w:t xml:space="preserve">It genuinely does something real and useful for a different, valid Pitching Agent need: proactive campaign targeting.</w:t>
+      </w:r>
+      <w:r>
+        <w:t xml:space="preserve"> Given a Focus Product, the confirmed flow produces (a) its historical purchase pattern (Step 2A — weekly sales, raw order records), (b) an LLM-inferred crop-seasonality read on that pattern — buildup/peak/closure weeks (Step 2B), and (c) a DC cohort to target for that product, informed by (a) and (b) (Step 3). That's a legitimate "which DCs to push this product to, and when" capability — complementary to, not a replacement for, the DC-first Dehaat Center Ko Jaano profile.</w:t>
+      </w:r>
+    </w:p>
+    <w:p>
+      <w:pPr>
+        <w:spacing w:after="160"/>
+      </w:pPr>
+      <w:r>
+        <w:rPr>
+          <w:b/>
+          <w:bCs/>
+        </w:rPr>
+        <w:t xml:space="preserve">Still not live-verified either way</w:t>
+      </w:r>
+      <w:r>
+        <w:t xml:space="preserve"> — credentials for this service were shared in chat, but this agent doesn't authenticate to external services or handle passwords under any circumstance, and the service's domain isn't reachable from this agent's network access regardless. Everything above is based on reading the Postman collection's request schemas — the actual response shape for Steps 2B and 3 is still unconfirmed (both saved responses are empty in the collection), so even the campaign-targeting use case isn't fully specified yet, just plausible from the request/description text.</w:t>
+      </w:r>
+    </w:p>
+    <w:p>
+      <w:pPr>
+        <w:spacing w:after="160"/>
+      </w:pPr>
+      <w:r>
+        <w:rPr>
+          <w:b/>
+          <w:bCs/>
+        </w:rPr>
+        <w:t xml:space="preserve">Confirmed query — Business Area Strength (top product sub-category by net value, per DC):</w:t>
+      </w:r>
+    </w:p>
+    <w:p>
+      <w:pPr>
+        <w:pBdr>
+          <w:top w:val="single" w:color="AAAAAA" w:sz="4" w:space="6"/>
+          <w:bottom w:val="single" w:color="AAAAAA" w:sz="4" w:space="6"/>
+          <w:left w:val="single" w:color="AAAAAA" w:sz="4" w:space="6"/>
+          <w:right w:val="single" w:color="AAAAAA" w:sz="4" w:space="6"/>
+        </w:pBdr>
+        <w:shd w:fill="F2F2F2" w:val="clear"/>
+        <w:spacing w:after="200" w:before="120"/>
+      </w:pPr>
+      <w:r>
+        <w:rPr>
+          <w:rFonts w:ascii="Consolas" w:cs="Consolas" w:eastAsia="Consolas" w:hAnsi="Consolas"/>
+          <w:color w:val="1F3864"/>
+          <w:sz w:val="18"/>
+          <w:szCs w:val="18"/>
+        </w:rPr>
+        <w:t xml:space="preserve">WITH category_totals AS (</w:t>
+      </w:r>
+      <w:r>
+        <w:br/>
+      </w:r>
+      <w:r>
+        <w:rPr>
+          <w:rFonts w:ascii="Consolas" w:cs="Consolas" w:eastAsia="Consolas" w:hAnsi="Consolas"/>
+          <w:color w:val="1F3864"/>
+          <w:sz w:val="18"/>
+          <w:szCs w:val="18"/>
+        </w:rPr>
+        <w:t xml:space="preserve">  SELECT</w:t>
+      </w:r>
+      <w:r>
+        <w:br/>
+      </w:r>
+      <w:r>
+        <w:rPr>
+          <w:rFonts w:ascii="Consolas" w:cs="Consolas" w:eastAsia="Consolas" w:hAnsi="Consolas"/>
+          <w:color w:val="1F3864"/>
+          <w:sz w:val="18"/>
+          <w:szCs w:val="18"/>
+        </w:rPr>
+        <w:t xml:space="preserve">    sor.partner_id AS dc_id,</w:t>
+      </w:r>
+      <w:r>
+        <w:br/>
+      </w:r>
+      <w:r>
+        <w:rPr>
+          <w:rFonts w:ascii="Consolas" w:cs="Consolas" w:eastAsia="Consolas" w:hAnsi="Consolas"/>
+          <w:color w:val="1F3864"/>
+          <w:sz w:val="18"/>
+          <w:szCs w:val="18"/>
+        </w:rPr>
+        <w:t xml:space="preserve">    pc.name AS category_name,</w:t>
+      </w:r>
+      <w:r>
+        <w:br/>
+      </w:r>
+      <w:r>
+        <w:rPr>
+          <w:rFonts w:ascii="Consolas" w:cs="Consolas" w:eastAsia="Consolas" w:hAnsi="Consolas"/>
+          <w:color w:val="1F3864"/>
+          <w:sz w:val="18"/>
+          <w:szCs w:val="18"/>
+        </w:rPr>
+        <w:t xml:space="preserve">    psc.name AS sub_category_name,</w:t>
+      </w:r>
+      <w:r>
+        <w:br/>
+      </w:r>
+      <w:r>
+        <w:rPr>
+          <w:rFonts w:ascii="Consolas" w:cs="Consolas" w:eastAsia="Consolas" w:hAnsi="Consolas"/>
+          <w:color w:val="1F3864"/>
+          <w:sz w:val="18"/>
+          <w:szCs w:val="18"/>
+        </w:rPr>
+        <w:t xml:space="preserve">    SUM(sol.price_unit * sol.quantity) AS gross_value,</w:t>
+      </w:r>
+      <w:r>
+        <w:br/>
+      </w:r>
+      <w:r>
+        <w:rPr>
+          <w:rFonts w:ascii="Consolas" w:cs="Consolas" w:eastAsia="Consolas" w:hAnsi="Consolas"/>
+          <w:color w:val="1F3864"/>
+          <w:sz w:val="18"/>
+          <w:szCs w:val="18"/>
+        </w:rPr>
+        <w:t xml:space="preserve">    SUM(sol.price_unit * sol.quantity) - COALESCE(SUM(sol.discount_price_unit * sol.quantity), 0) AS net_value,</w:t>
+      </w:r>
+      <w:r>
+        <w:br/>
+      </w:r>
+      <w:r>
+        <w:rPr>
+          <w:rFonts w:ascii="Consolas" w:cs="Consolas" w:eastAsia="Consolas" w:hAnsi="Consolas"/>
+          <w:color w:val="1F3864"/>
+          <w:sz w:val="18"/>
+          <w:szCs w:val="18"/>
+        </w:rPr>
+        <w:t xml:space="preserve">    SUM(sol.quantity) AS total_quantity,</w:t>
+      </w:r>
+      <w:r>
+        <w:br/>
+      </w:r>
+      <w:r>
+        <w:rPr>
+          <w:rFonts w:ascii="Consolas" w:cs="Consolas" w:eastAsia="Consolas" w:hAnsi="Consolas"/>
+          <w:color w:val="1F3864"/>
+          <w:sz w:val="18"/>
+          <w:szCs w:val="18"/>
+        </w:rPr>
+        <w:t xml:space="preserve">    COUNT(DISTINCT sol.order_request_id) AS order_count</w:t>
+      </w:r>
+      <w:r>
+        <w:br/>
+      </w:r>
+      <w:r>
+        <w:rPr>
+          <w:rFonts w:ascii="Consolas" w:cs="Consolas" w:eastAsia="Consolas" w:hAnsi="Consolas"/>
+          <w:color w:val="1F3864"/>
+          <w:sz w:val="18"/>
+          <w:szCs w:val="18"/>
+        </w:rPr>
+        <w:t xml:space="preserve">  FROM sale_orderrequestline sol</w:t>
+      </w:r>
+      <w:r>
+        <w:br/>
+      </w:r>
+      <w:r>
+        <w:rPr>
+          <w:rFonts w:ascii="Consolas" w:cs="Consolas" w:eastAsia="Consolas" w:hAnsi="Consolas"/>
+          <w:color w:val="1F3864"/>
+          <w:sz w:val="18"/>
+          <w:szCs w:val="18"/>
+        </w:rPr>
+        <w:t xml:space="preserve">  JOIN sale_orderrequest sor ON sol.order_request_id = sor.id</w:t>
+      </w:r>
+      <w:r>
+        <w:br/>
+      </w:r>
+      <w:r>
+        <w:rPr>
+          <w:rFonts w:ascii="Consolas" w:cs="Consolas" w:eastAsia="Consolas" w:hAnsi="Consolas"/>
+          <w:color w:val="1F3864"/>
+          <w:sz w:val="18"/>
+          <w:szCs w:val="18"/>
+        </w:rPr>
+        <w:t xml:space="preserve">  JOIN products_product p ON sol.product_id = p.id</w:t>
+      </w:r>
+      <w:r>
+        <w:br/>
+      </w:r>
+      <w:r>
+        <w:rPr>
+          <w:rFonts w:ascii="Consolas" w:cs="Consolas" w:eastAsia="Consolas" w:hAnsi="Consolas"/>
+          <w:color w:val="1F3864"/>
+          <w:sz w:val="18"/>
+          <w:szCs w:val="18"/>
+        </w:rPr>
+        <w:t xml:space="preserve">  JOIN products_template pt ON p.template_id = pt.id</w:t>
+      </w:r>
+      <w:r>
+        <w:br/>
+      </w:r>
+      <w:r>
+        <w:rPr>
+          <w:rFonts w:ascii="Consolas" w:cs="Consolas" w:eastAsia="Consolas" w:hAnsi="Consolas"/>
+          <w:color w:val="1F3864"/>
+          <w:sz w:val="18"/>
+          <w:szCs w:val="18"/>
+        </w:rPr>
+        <w:t xml:space="preserve">  LEFT JOIN products_category pc ON pt.category_id = pc.id</w:t>
+      </w:r>
+      <w:r>
+        <w:br/>
+      </w:r>
+      <w:r>
+        <w:rPr>
+          <w:rFonts w:ascii="Consolas" w:cs="Consolas" w:eastAsia="Consolas" w:hAnsi="Consolas"/>
+          <w:color w:val="1F3864"/>
+          <w:sz w:val="18"/>
+          <w:szCs w:val="18"/>
+        </w:rPr>
+        <w:t xml:space="preserve">  LEFT JOIN products_subcategory psc ON pt.sub_category_id = psc.id</w:t>
+      </w:r>
+      <w:r>
+        <w:br/>
+      </w:r>
+      <w:r>
+        <w:rPr>
+          <w:rFonts w:ascii="Consolas" w:cs="Consolas" w:eastAsia="Consolas" w:hAnsi="Consolas"/>
+          <w:color w:val="1F3864"/>
+          <w:sz w:val="18"/>
+          <w:szCs w:val="18"/>
+        </w:rPr>
+        <w:t xml:space="preserve">  WHERE sor.created_at &gt;= CURRENT_DATE - INTERVAL '12 months'</w:t>
+      </w:r>
+      <w:r>
+        <w:br/>
+      </w:r>
+      <w:r>
+        <w:rPr>
+          <w:rFonts w:ascii="Consolas" w:cs="Consolas" w:eastAsia="Consolas" w:hAnsi="Consolas"/>
+          <w:color w:val="1F3864"/>
+          <w:sz w:val="18"/>
+          <w:szCs w:val="18"/>
+        </w:rPr>
+        <w:t xml:space="preserve">    AND sor.status = 'processed'</w:t>
+      </w:r>
+      <w:r>
+        <w:br/>
+      </w:r>
+      <w:r>
+        <w:rPr>
+          <w:rFonts w:ascii="Consolas" w:cs="Consolas" w:eastAsia="Consolas" w:hAnsi="Consolas"/>
+          <w:color w:val="1F3864"/>
+          <w:sz w:val="18"/>
+          <w:szCs w:val="18"/>
+        </w:rPr>
+        <w:t xml:space="preserve">  GROUP BY sor.partner_id, pc.name, psc.name</w:t>
+      </w:r>
+      <w:r>
+        <w:br/>
+      </w:r>
+      <w:r>
+        <w:rPr>
+          <w:rFonts w:ascii="Consolas" w:cs="Consolas" w:eastAsia="Consolas" w:hAnsi="Consolas"/>
+          <w:color w:val="1F3864"/>
+          <w:sz w:val="18"/>
+          <w:szCs w:val="18"/>
+        </w:rPr>
+        <w:t xml:space="preserve">),</w:t>
+      </w:r>
+      <w:r>
+        <w:br/>
+      </w:r>
+      <w:r>
+        <w:rPr>
+          <w:rFonts w:ascii="Consolas" w:cs="Consolas" w:eastAsia="Consolas" w:hAnsi="Consolas"/>
+          <w:color w:val="1F3864"/>
+          <w:sz w:val="18"/>
+          <w:szCs w:val="18"/>
+        </w:rPr>
+        <w:t xml:space="preserve">ranked AS (</w:t>
+      </w:r>
+      <w:r>
+        <w:br/>
+      </w:r>
+      <w:r>
+        <w:rPr>
+          <w:rFonts w:ascii="Consolas" w:cs="Consolas" w:eastAsia="Consolas" w:hAnsi="Consolas"/>
+          <w:color w:val="1F3864"/>
+          <w:sz w:val="18"/>
+          <w:szCs w:val="18"/>
+        </w:rPr>
+        <w:t xml:space="preserve">  SELECT *,</w:t>
+      </w:r>
+      <w:r>
+        <w:br/>
+      </w:r>
+      <w:r>
+        <w:rPr>
+          <w:rFonts w:ascii="Consolas" w:cs="Consolas" w:eastAsia="Consolas" w:hAnsi="Consolas"/>
+          <w:color w:val="1F3864"/>
+          <w:sz w:val="18"/>
+          <w:szCs w:val="18"/>
+        </w:rPr>
+        <w:t xml:space="preserve">    ROW_NUMBER() OVER (PARTITION BY dc_id ORDER BY net_value DESC, sub_category_name ASC) AS rn</w:t>
+      </w:r>
+      <w:r>
+        <w:br/>
+      </w:r>
+      <w:r>
+        <w:rPr>
+          <w:rFonts w:ascii="Consolas" w:cs="Consolas" w:eastAsia="Consolas" w:hAnsi="Consolas"/>
+          <w:color w:val="1F3864"/>
+          <w:sz w:val="18"/>
+          <w:szCs w:val="18"/>
+        </w:rPr>
+        <w:t xml:space="preserve">  FROM category_totals</w:t>
+      </w:r>
+      <w:r>
+        <w:br/>
+      </w:r>
+      <w:r>
+        <w:rPr>
+          <w:rFonts w:ascii="Consolas" w:cs="Consolas" w:eastAsia="Consolas" w:hAnsi="Consolas"/>
+          <w:color w:val="1F3864"/>
+          <w:sz w:val="18"/>
+          <w:szCs w:val="18"/>
+        </w:rPr>
+        <w:t xml:space="preserve">)</w:t>
+      </w:r>
+      <w:r>
+        <w:br/>
+      </w:r>
+      <w:r>
+        <w:rPr>
+          <w:rFonts w:ascii="Consolas" w:cs="Consolas" w:eastAsia="Consolas" w:hAnsi="Consolas"/>
+          <w:color w:val="1F3864"/>
+          <w:sz w:val="18"/>
+          <w:szCs w:val="18"/>
+        </w:rPr>
+        <w:t xml:space="preserve">SELECT dc_id, category_name, sub_category_name, net_value, total_quantity, order_count</w:t>
+      </w:r>
+      <w:r>
+        <w:br/>
+      </w:r>
+      <w:r>
+        <w:rPr>
+          <w:rFonts w:ascii="Consolas" w:cs="Consolas" w:eastAsia="Consolas" w:hAnsi="Consolas"/>
+          <w:color w:val="1F3864"/>
+          <w:sz w:val="18"/>
+          <w:szCs w:val="18"/>
+        </w:rPr>
+        <w:t xml:space="preserve">FROM ranked</w:t>
+      </w:r>
+      <w:r>
+        <w:br/>
+      </w:r>
+      <w:r>
+        <w:rPr>
+          <w:rFonts w:ascii="Consolas" w:cs="Consolas" w:eastAsia="Consolas" w:hAnsi="Consolas"/>
+          <w:color w:val="1F3864"/>
+          <w:sz w:val="18"/>
+          <w:szCs w:val="18"/>
+        </w:rPr>
+        <w:t xml:space="preserve">WHERE rn = 1;</w:t>
+      </w:r>
+    </w:p>
+    <w:p>
+      <w:pPr>
+        <w:spacing w:after="160"/>
+      </w:pPr>
+      <w:r>
+        <w:t xml:space="preserve">Live-tested against database_id 31 — real results across 10,206 DCs with purchase activity in the last 12 months (e.g. Herbicide, Fungicide, Cereal Crops Seeds, Bulk Fertilizers all appear as genuine top categories for different DCs). One correction made during testing, not obvious from the query shape alone: an initial version used RANK() instead of ROW_NUMBER(), which returned 2 rows for any DC with a tie for its top category — confirmed live, this affected 3 of 10,206 DCs (0.03%, small but real). Switched to ROW_NUMBER() with a deterministic tie-break (sub_category_name ASC) to guarantee exactly one row per DC — verified: 10,206 output rows for 10,206 distinct DCs, one-to-one. Also checked: product_category/product_sub_category are 100% populated (0 nulls across 332,803 line items in the window), so no null-handling concern here.</w:t>
       </w:r>
     </w:p>
     <w:p>
@@ -15252,10 +16727,10 @@
           <w:b/>
           <w:bCs/>
         </w:rPr>
-        <w:t xml:space="preserve">Down to 1 open gap in this document, from a peak of 12.</w:t>
-      </w:r>
-      <w:r>
-        <w:t xml:space="preserve"> Three items resolved this round by business decision: Visit_Duration_Minutes is now a confirmed flat 45 minutes for both planning and grading — note the consequence, BO2's Valid_Visit rule now depends only on Photo_Logged, since the duration condition always passes. Current Inventory is descoped — DC-level stock intentionally out of scope, not pursued. Suggested Discount's methodology is confirmed — combine coupon_analysis history with the Same Block Purchase pattern. Only Source 6 (AOP/target file) remains genuinely open, blocking the BO Scoring Engine's BO1/BO4 AOP-dependent formulas. The DC coordinate tie-break that previously blocked the Routing Agent's stop placement was also resolved earlier this session (see Source 3e) — customer_management_customer is confirmed primary.</w:t>
+        <w:t xml:space="preserve">2 open gaps in this document, from a peak of 12.</w:t>
+      </w:r>
+      <w:r>
+        <w:t xml:space="preserve"> Three items resolved earlier this round by business decision: Visit_Duration_Minutes is now a confirmed flat 45 minutes for both planning and grading — note the consequence, BO2's Valid_Visit rule now depends only on Photo_Logged, since the duration condition always passes. Current Inventory is descoped — DC-level stock intentionally out of scope, not pursued. Suggested Discount's methodology is confirmed — combine coupon_analysis history with the Same Block Purchase pattern. Source 6 (AOP/target file) remains open, blocking the BO Scoring Engine's BO1/BO4 AOP-dependent formulas. A new gap surfaced by the "Dehaat Center Ko Jaano" framework: no confirmed source classifies a DC by the crop(s) its farmers grow — blocks that framework's "Where DC Stand" category for the Pitching Agent only, nothing else. The DC coordinate tie-break that previously blocked the Routing Agent's stop placement was also resolved earlier this session (see Source 3e) — customer_management_customer is confirmed primary.</w:t>
       </w:r>
     </w:p>
     <w:p>
@@ -17040,6 +18515,117 @@
           </w:p>
         </w:tc>
       </w:tr>
+      <w:tr>
+        <w:trPr>
+          <w:tblHeader w:val="false"/>
+        </w:trPr>
+        <w:tc>
+          <w:tcPr>
+            <w:tcW w:type="dxa" w:w="4200"/>
+            <w:tcMar>
+              <w:top w:type="dxa" w:w="100"/>
+              <w:left w:type="dxa" w:w="120"/>
+              <w:bottom w:type="dxa" w:w="100"/>
+              <w:right w:type="dxa" w:w="120"/>
+            </w:tcMar>
+          </w:tcPr>
+          <w:p>
+            <w:r>
+              <w:t xml:space="preserve">Product_Cohort_-sps-v1-fp_postman_collection.json</w:t>
+            </w:r>
+          </w:p>
+        </w:tc>
+        <w:tc>
+          <w:tcPr>
+            <w:tcW w:type="dxa" w:w="5700"/>
+            <w:tcMar>
+              <w:top w:type="dxa" w:w="100"/>
+              <w:left w:type="dxa" w:w="120"/>
+              <w:bottom w:type="dxa" w:w="100"/>
+              <w:right w:type="dxa" w:w="120"/>
+            </w:tcMar>
+          </w:tcPr>
+          <w:p>
+            <w:r>
+              <w:t xml:space="preserve">Uploaded file — Postman collection for an internal "Product Cohort" tool. Doesn't resolve the DC-first crop-classification gap (Section 10) — it's product-centric, the inverse direction. Does confirm a real, separate capability: Focus Product campaign targeting (historical purchase → crop-seasonality inference → DC cohort, per product). Not live-verified either way — response schemas for the relevant steps are empty in the collection, no authenticated access performed.</w:t>
+            </w:r>
+          </w:p>
+        </w:tc>
+      </w:tr>
+      <w:tr>
+        <w:trPr>
+          <w:tblHeader w:val="false"/>
+        </w:trPr>
+        <w:tc>
+          <w:tcPr>
+            <w:tcW w:type="dxa" w:w="4200"/>
+            <w:tcMar>
+              <w:top w:type="dxa" w:w="100"/>
+              <w:left w:type="dxa" w:w="120"/>
+              <w:bottom w:type="dxa" w:w="100"/>
+              <w:right w:type="dxa" w:w="120"/>
+            </w:tcMar>
+          </w:tcPr>
+          <w:p>
+            <w:r>
+              <w:t xml:space="preserve">Product_Cohort_postman_environment.json</w:t>
+            </w:r>
+          </w:p>
+        </w:tc>
+        <w:tc>
+          <w:tcPr>
+            <w:tcW w:type="dxa" w:w="5700"/>
+            <w:tcMar>
+              <w:top w:type="dxa" w:w="100"/>
+              <w:left w:type="dxa" w:w="120"/>
+              <w:bottom w:type="dxa" w:w="100"/>
+              <w:right w:type="dxa" w:w="120"/>
+            </w:tcMar>
+          </w:tcPr>
+          <w:p>
+            <w:r>
+              <w:t xml:space="preserve">Uploaded file — environment config for the above; confirms the service is hosted at saas-platform-service.api.dehat.net, separate from every database this document otherwise references.</w:t>
+            </w:r>
+          </w:p>
+        </w:tc>
+      </w:tr>
+      <w:tr>
+        <w:trPr>
+          <w:tblHeader w:val="false"/>
+        </w:trPr>
+        <w:tc>
+          <w:tcPr>
+            <w:tcW w:type="dxa" w:w="4200"/>
+            <w:tcMar>
+              <w:top w:type="dxa" w:w="100"/>
+              <w:left w:type="dxa" w:w="120"/>
+              <w:bottom w:type="dxa" w:w="100"/>
+              <w:right w:type="dxa" w:w="120"/>
+            </w:tcMar>
+          </w:tcPr>
+          <w:p>
+            <w:r>
+              <w:t xml:space="preserve">PRODUCT_COHORT_AUTH.md</w:t>
+            </w:r>
+          </w:p>
+        </w:tc>
+        <w:tc>
+          <w:tcPr>
+            <w:tcW w:type="dxa" w:w="5700"/>
+            <w:tcMar>
+              <w:top w:type="dxa" w:w="100"/>
+              <w:left w:type="dxa" w:w="120"/>
+              <w:bottom w:type="dxa" w:w="100"/>
+              <w:right w:type="dxa" w:w="120"/>
+            </w:tcMar>
+          </w:tcPr>
+          <w:p>
+            <w:r>
+              <w:t xml:space="preserve">Uploaded file — auth setup instructions for the above; not used, since this agent doesn't authenticate to external services.</w:t>
+            </w:r>
+          </w:p>
+        </w:tc>
+      </w:tr>
     </w:tbl>
     <w:p>
       <w:pPr>
@@ -17347,7 +18933,7 @@
         <w:spacing w:after="160"/>
       </w:pPr>
       <w:r>
-        <w:t xml:space="preserve">Remaining known gap — just one now: Visit_Duration_Minutes is fully resolved (45 minutes, confirmed for both planning and grading, business decision this round — note the consequence: BO2's Valid_Visit rule now depends only on Photo_Logged, since the duration condition always passes). Current Inventory is descoped — intentionally out of scope, not pursued further. Suggested Discount's methodology is confirmed — combine coupon_analysis history with the Same Block Purchase pattern. The DC coordinate tie-break the Routing Agent surfaced is resolved — customer_management_customer confirmed primary, via a 100%-clean join on task_management_task.partner_id (see Source 3e). Source 6 (AOP/target file) is the only thing left open in this entire document.</w:t>
+        <w:t xml:space="preserve">Remaining known gaps — two now: Visit_Duration_Minutes is fully resolved (45 minutes, confirmed for both planning and grading, business decision this round — note the consequence: BO2's Valid_Visit rule now depends only on Photo_Logged, since the duration condition always passes). Current Inventory is descoped — intentionally out of scope, not pursued further. Suggested Discount's methodology is confirmed — combine coupon_analysis history with the Same Block Purchase pattern. The DC coordinate tie-break the Routing Agent surfaced is resolved — customer_management_customer confirmed primary, via a 100%-clean join on task_management_task.partner_id (see Source 3e). What's left: Source 6 (AOP/target file), and a new gap from the "Dehaat Center Ko Jaano" framework — no confirmed source classifies a DC by the crop(s) its farmers grow.</w:t>
       </w:r>
     </w:p>
     <w:sectPr>

</xml_diff>